<commit_message>
Hoan thanh 9 loai HDTD
</commit_message>
<xml_diff>
--- a/src/main/resources/templates/BienBanXacDinhGiaTriTaiSanBaoDam.docx
+++ b/src/main/resources/templates/BienBanXacDinhGiaTriTaiSanBaoDam.docx
@@ -182,16 +182,9 @@
       <w:r>
         <w:rPr>
           <w:rFonts w:ascii="Times New Roman" w:hAnsi="Times New Roman"/>
-          <w:b/>
           <w:sz w:val="26"/>
         </w:rPr>
         <w:tab/>
-      </w:r>
-      <w:r>
-        <w:rPr>
-          <w:rFonts w:ascii="Times New Roman" w:hAnsi="Times New Roman"/>
-          <w:sz w:val="26"/>
-        </w:rPr>
         <w:t>Hôm nay, ngày {{dayBD}} tháng {{monthBD}} năm {{yearBD}} tại trụ sở Quỹ TDND Thái Học, chúng tôi gồm:</w:t>
       </w:r>
     </w:p>
@@ -470,79 +463,95 @@
           <w:sz w:val="24"/>
           <w:szCs w:val="26"/>
         </w:rPr>
-        <w:t>Địa chỉ: {{ttkh}}.</w:t>
-      </w:r>
-    </w:p>
-    <w:p>
-      <w:pPr>
-        <w:pStyle w:val="ListParagraph"/>
+        <w:t>Địa chỉ</w:t>
+      </w:r>
+      <w:r>
         <w:rPr>
           <w:rFonts w:ascii="Times New Roman" w:hAnsi="Times New Roman"/>
           <w:sz w:val="24"/>
           <w:szCs w:val="26"/>
         </w:rPr>
-      </w:pPr>
-      <w:r>
+        <w:t>: {{ttkh}}</w:t>
+      </w:r>
+    </w:p>
+    <w:p>
+      <w:pPr>
+        <w:pStyle w:val="ListParagraph"/>
         <w:rPr>
           <w:rFonts w:ascii="Times New Roman" w:hAnsi="Times New Roman"/>
           <w:sz w:val="24"/>
           <w:szCs w:val="26"/>
         </w:rPr>
-        <w:t>{{gtnt}}: {{ntkh}}; Sinh ngày: {{nsnt}};</w:t>
-      </w:r>
-    </w:p>
-    <w:p>
-      <w:pPr>
-        <w:pStyle w:val="ListParagraph"/>
+      </w:pPr>
+      <w:r>
         <w:rPr>
           <w:rFonts w:ascii="Times New Roman" w:hAnsi="Times New Roman"/>
           <w:sz w:val="24"/>
           <w:szCs w:val="26"/>
         </w:rPr>
-      </w:pPr>
-      <w:r>
+        <w:t>{{gtnt}}: {{ntkh}}; Sinh ngày: {{nsnt}};</w:t>
+      </w:r>
+    </w:p>
+    <w:p>
+      <w:pPr>
+        <w:pStyle w:val="ListParagraph"/>
         <w:rPr>
           <w:rFonts w:ascii="Times New Roman" w:hAnsi="Times New Roman"/>
           <w:sz w:val="24"/>
           <w:szCs w:val="26"/>
         </w:rPr>
-        <w:t xml:space="preserve">CMTND hoặc CCCD số: {{cccdnt}}; Cấp ngày: {{ncnt}}; </w:t>
-      </w:r>
-    </w:p>
-    <w:p>
-      <w:pPr>
-        <w:pStyle w:val="ListParagraph"/>
+      </w:pPr>
+      <w:r>
         <w:rPr>
           <w:rFonts w:ascii="Times New Roman" w:hAnsi="Times New Roman"/>
           <w:sz w:val="24"/>
           <w:szCs w:val="26"/>
         </w:rPr>
-      </w:pPr>
-      <w:r>
+        <w:t xml:space="preserve">CMTND hoặc CCCD số: {{cccdnt}}; Cấp ngày: {{ncnt}}; </w:t>
+      </w:r>
+    </w:p>
+    <w:p>
+      <w:pPr>
+        <w:pStyle w:val="ListParagraph"/>
         <w:rPr>
           <w:rFonts w:ascii="Times New Roman" w:hAnsi="Times New Roman"/>
           <w:sz w:val="24"/>
           <w:szCs w:val="26"/>
         </w:rPr>
-        <w:t>Nơi cấp: {{ttnt}}.</w:t>
-      </w:r>
-    </w:p>
-    <w:p>
-      <w:pPr>
-        <w:pStyle w:val="ListParagraph"/>
+      </w:pPr>
+      <w:r>
         <w:rPr>
           <w:rFonts w:ascii="Times New Roman" w:hAnsi="Times New Roman"/>
           <w:sz w:val="24"/>
           <w:szCs w:val="26"/>
         </w:rPr>
-      </w:pPr>
-      <w:r>
+        <w:t>Nơi cấp: {{ttnt}}.</w:t>
+      </w:r>
+    </w:p>
+    <w:p>
+      <w:pPr>
+        <w:pStyle w:val="ListParagraph"/>
         <w:rPr>
           <w:rFonts w:ascii="Times New Roman" w:hAnsi="Times New Roman"/>
           <w:sz w:val="24"/>
           <w:szCs w:val="26"/>
         </w:rPr>
-        <w:t>Địa chỉ: {{ttnt}}.</w:t>
+      </w:pPr>
+      <w:r>
+        <w:rPr>
+          <w:rFonts w:ascii="Times New Roman" w:hAnsi="Times New Roman"/>
+          <w:sz w:val="24"/>
+          <w:szCs w:val="26"/>
+        </w:rPr>
+        <w:t>Địa chỉ</w:t>
+      </w:r>
+      <w:r>
+        <w:rPr>
+          <w:rFonts w:ascii="Times New Roman" w:hAnsi="Times New Roman"/>
+          <w:sz w:val="24"/>
+          <w:szCs w:val="26"/>
+        </w:rPr>
+        <w:t>: {{ttnt}}</w:t>
       </w:r>
     </w:p>
     <w:p>
@@ -706,14 +715,23 @@
           <w:rFonts w:ascii="Times New Roman" w:hAnsi="Times New Roman"/>
           <w:sz w:val="26"/>
         </w:rPr>
-        <w:t xml:space="preserve">Giấy </w:t>
-      </w:r>
-      <w:r>
-        <w:rPr>
-          <w:rFonts w:ascii="Times New Roman" w:hAnsi="Times New Roman"/>
-          <w:sz w:val="26"/>
-        </w:rPr>
-        <w:t>chứng nhận quyền sử dụng đất quyền sở hữu nhà ở và tài sản khác gắn liền với đất, số phát hành {{seri}}, vào số cấp sổ: {{vsmt}}, ngày cấp: {{ngc}}, nơi cấp: {{nc}}</w:t>
+        <w:t>{{ndnb</w:t>
+      </w:r>
+      <w:bookmarkStart w:id="0" w:name="_GoBack"/>
+      <w:bookmarkEnd w:id="0"/>
+      <w:r>
+        <w:rPr>
+          <w:rFonts w:ascii="Times New Roman" w:hAnsi="Times New Roman"/>
+          <w:sz w:val="26"/>
+        </w:rPr>
+        <w:t>}}</w:t>
+      </w:r>
+      <w:r>
+        <w:rPr>
+          <w:rFonts w:ascii="Times New Roman" w:hAnsi="Times New Roman"/>
+          <w:sz w:val="26"/>
+        </w:rPr>
+        <w:t>, số phát hành {{seri}}, vào số cấp sổ: {{vsmt}}, ngày cấp: {{ngc}}, nơi cấp: {{nc}}</w:t>
       </w:r>
       <w:r>
         <w:rPr>
@@ -1357,8 +1375,6 @@
         </w:rPr>
         <w:t>h</w:t>
       </w:r>
-      <w:bookmarkStart w:id="0" w:name="_GoBack"/>
-      <w:bookmarkEnd w:id="0"/>
       <w:r>
         <w:rPr>
           <w:rFonts w:ascii="Times New Roman" w:hAnsi="Times New Roman"/>

</xml_diff>

<commit_message>
hoan thanh bao cao tham dinh
</commit_message>
<xml_diff>
--- a/src/main/resources/templates/BienBanXacDinhGiaTriTaiSanBaoDam.docx
+++ b/src/main/resources/templates/BienBanXacDinhGiaTriTaiSanBaoDam.docx
@@ -1319,24 +1319,38 @@
           <w:rFonts w:ascii="13" w:hAnsi="13"/>
           <w:sz w:val="26"/>
         </w:rPr>
-        <w:t>: {{gtkht}}</w:t>
-      </w:r>
-      <w:r>
-        <w:rPr>
-          <w:rFonts w:ascii="13" w:hAnsi="13"/>
-          <w:sz w:val="26"/>
-        </w:rPr>
-        <w:t xml:space="preserve"> {{kh}} </w:t>
-      </w:r>
-      <w:r>
-        <w:rPr>
-          <w:rFonts w:ascii="13" w:hAnsi="13"/>
-          <w:sz w:val="26"/>
-        </w:rPr>
-        <w:t xml:space="preserve">{{ntbd}} </w:t>
+        <w:t>: {{gtkhbdt}}: {{khbd}}</w:t>
+      </w:r>
+      <w:r>
+        <w:rPr>
+          <w:rFonts w:ascii="13" w:hAnsi="13"/>
+          <w:sz w:val="26"/>
+        </w:rPr>
+        <w:t xml:space="preserve"> </w:t>
+      </w:r>
+      <w:r>
+        <w:rPr>
+          <w:rFonts w:ascii="13" w:hAnsi="13"/>
+          <w:sz w:val="26"/>
+        </w:rPr>
+        <w:t>{{gtntbdt}}</w:t>
       </w:r>
       <w:bookmarkStart w:id="0" w:name="_GoBack"/>
       <w:bookmarkEnd w:id="0"/>
+      <w:r>
+        <w:rPr>
+          <w:rFonts w:ascii="13" w:hAnsi="13"/>
+          <w:sz w:val="26"/>
+        </w:rPr>
+        <w:t xml:space="preserve">: </w:t>
+      </w:r>
+      <w:r>
+        <w:rPr>
+          <w:rFonts w:ascii="13" w:hAnsi="13"/>
+          <w:sz w:val="26"/>
+        </w:rPr>
+        <w:t xml:space="preserve">{{ntbd}} </w:t>
+      </w:r>
       <w:r>
         <w:rPr>
           <w:rFonts w:ascii="13" w:hAnsi="13"/>

</xml_diff>